<commit_message>
Agregar reglas del negocio al documento
</commit_message>
<xml_diff>
--- a/Requerimientos Funcionales, No Funcionales yy Reglas de nefocio.docx
+++ b/Requerimientos Funcionales, No Funcionales yy Reglas de nefocio.docx
@@ -74,23 +74,7 @@
           <w:sz w:val="24"/>
           <w:szCs w:val="24"/>
         </w:rPr>
-        <w:t>Ofertas por el contrato a la que estas pertenecen, entidad a las que pertenecen dicho contrato, descripción o rango de fecha</w:t>
-      </w:r>
-      <w:r>
-        <w:rPr>
-          <w:rFonts w:ascii="Arial" w:hAnsi="Arial" w:cs="Arial"/>
-          <w:sz w:val="24"/>
-          <w:szCs w:val="24"/>
-        </w:rPr>
-        <w:t xml:space="preserve"> de vigencia de estas</w:t>
-      </w:r>
-      <w:r>
-        <w:rPr>
-          <w:rFonts w:ascii="Arial" w:hAnsi="Arial" w:cs="Arial"/>
-          <w:sz w:val="24"/>
-          <w:szCs w:val="24"/>
-        </w:rPr>
-        <w:t>.</w:t>
+        <w:t>Ofertas por el contrato a la que estas pertenecen, entidad a las que pertenecen dicho contrato, descripción o rango de fecha de vigencia de estas.</w:t>
       </w:r>
     </w:p>
     <w:p>
@@ -300,7 +284,45 @@
           <w:sz w:val="24"/>
           <w:szCs w:val="24"/>
         </w:rPr>
-        <w:t xml:space="preserve">Los usuarios pueden cambiar su contraseña en cualquier momento conociendo la vieja contraseña. </w:t>
+        <w:t>Los usuarios pueden cambiar su contraseña en cualquier momento conociendo la vieja contraseña.</w:t>
+      </w:r>
+    </w:p>
+    <w:p>
+      <w:pPr>
+        <w:pStyle w:val="Prrafodelista"/>
+        <w:numPr>
+          <w:ilvl w:val="0"/>
+          <w:numId w:val="2"/>
+        </w:numPr>
+        <w:rPr>
+          <w:rFonts w:ascii="Arial" w:hAnsi="Arial" w:cs="Arial"/>
+          <w:sz w:val="24"/>
+          <w:szCs w:val="24"/>
+        </w:rPr>
+      </w:pPr>
+      <w:r>
+        <w:rPr>
+          <w:rFonts w:ascii="Arial" w:hAnsi="Arial" w:cs="Arial"/>
+          <w:sz w:val="24"/>
+          <w:szCs w:val="24"/>
+        </w:rPr>
+        <w:t>Alertar al usuario cuando un contrato esté próximo a su fecha de vencimiento.</w:t>
+      </w:r>
+      <w:r>
+        <w:rPr>
+          <w:rFonts w:ascii="Arial" w:hAnsi="Arial" w:cs="Arial"/>
+          <w:sz w:val="24"/>
+          <w:szCs w:val="24"/>
+        </w:rPr>
+        <w:t xml:space="preserve"> </w:t>
+      </w:r>
+      <w:r>
+        <w:rPr>
+          <w:rFonts w:ascii="Arial" w:hAnsi="Arial" w:cs="Arial"/>
+          <w:sz w:val="24"/>
+          <w:szCs w:val="24"/>
+        </w:rPr>
+        <w:t>(1 mes)</w:t>
       </w:r>
     </w:p>
     <w:p>
@@ -383,15 +405,7 @@
           <w:sz w:val="24"/>
           <w:szCs w:val="24"/>
         </w:rPr>
-        <w:t>Gestionar (Agregar, modificar, eliminar, ver)</w:t>
-      </w:r>
-      <w:r>
-        <w:rPr>
-          <w:rFonts w:ascii="Arial" w:hAnsi="Arial" w:cs="Arial"/>
-          <w:sz w:val="24"/>
-          <w:szCs w:val="24"/>
-        </w:rPr>
-        <w:t xml:space="preserve"> los Tipos de contrato del sistema.</w:t>
+        <w:t>Gestionar (Agregar, modificar, eliminar, ver) los Tipos de contrato del sistema.</w:t>
       </w:r>
     </w:p>
     <w:p>
@@ -413,8 +427,52 @@
           <w:sz w:val="24"/>
           <w:szCs w:val="24"/>
         </w:rPr>
-        <w:t>Gestionar (Agregar, modificar, eliminar, ver)</w:t>
-      </w:r>
+        <w:t xml:space="preserve">Gestionar (Agregar, modificar, eliminar, ver) </w:t>
+      </w:r>
+      <w:r>
+        <w:rPr>
+          <w:rFonts w:ascii="Arial" w:hAnsi="Arial" w:cs="Arial"/>
+          <w:sz w:val="24"/>
+          <w:szCs w:val="24"/>
+        </w:rPr>
+        <w:t>los Contratos del sistema que tenga una Entidad y un Tipo de Contrato.</w:t>
+      </w:r>
+    </w:p>
+    <w:p>
+      <w:pPr>
+        <w:pStyle w:val="Prrafodelista"/>
+        <w:numPr>
+          <w:ilvl w:val="0"/>
+          <w:numId w:val="2"/>
+        </w:numPr>
+        <w:rPr>
+          <w:rFonts w:ascii="Arial" w:hAnsi="Arial" w:cs="Arial"/>
+          <w:sz w:val="24"/>
+          <w:szCs w:val="24"/>
+        </w:rPr>
+      </w:pPr>
+      <w:r>
+        <w:rPr>
+          <w:rFonts w:ascii="Arial" w:hAnsi="Arial" w:cs="Arial"/>
+          <w:sz w:val="24"/>
+          <w:szCs w:val="24"/>
+        </w:rPr>
+        <w:t>Gestionar (Agregar, modificar, eliminar, ver) las Ofertas a un Contrato en específico.</w:t>
+      </w:r>
+    </w:p>
+    <w:p>
+      <w:pPr>
+        <w:pStyle w:val="Prrafodelista"/>
+        <w:numPr>
+          <w:ilvl w:val="0"/>
+          <w:numId w:val="2"/>
+        </w:numPr>
+        <w:rPr>
+          <w:rFonts w:ascii="Arial" w:hAnsi="Arial" w:cs="Arial"/>
+          <w:sz w:val="24"/>
+          <w:szCs w:val="24"/>
+        </w:rPr>
+      </w:pPr>
       <w:r>
         <w:rPr>
           <w:rFonts w:ascii="Arial" w:hAnsi="Arial" w:cs="Arial"/>
@@ -429,7 +487,7 @@
           <w:sz w:val="24"/>
           <w:szCs w:val="24"/>
         </w:rPr>
-        <w:t>los Contratos del sistema que tenga una Entidad y un Tipo de Contrato.</w:t>
+        <w:t>Gestionar (Agregar, modificar, eliminar, ver) los Trabajadores Autorizados a firmar un contrato.</w:t>
       </w:r>
     </w:p>
     <w:p>
@@ -451,15 +509,24 @@
           <w:sz w:val="24"/>
           <w:szCs w:val="24"/>
         </w:rPr>
-        <w:t>Gestionar (Agregar, modificar, eliminar, ver)</w:t>
-      </w:r>
-      <w:r>
-        <w:rPr>
-          <w:rFonts w:ascii="Arial" w:hAnsi="Arial" w:cs="Arial"/>
-          <w:sz w:val="24"/>
-          <w:szCs w:val="24"/>
-        </w:rPr>
-        <w:t xml:space="preserve"> las Ofertas a un Contrato en específico.</w:t>
+        <w:t>Gestionar (Agregar, modificar, eliminar, ver) la asociación de Trabajadores Autorizados a contratos.</w:t>
+      </w:r>
+    </w:p>
+    <w:p>
+      <w:pPr>
+        <w:rPr>
+          <w:rFonts w:ascii="Arial" w:hAnsi="Arial" w:cs="Arial"/>
+          <w:sz w:val="24"/>
+          <w:szCs w:val="24"/>
+        </w:rPr>
+      </w:pPr>
+      <w:r>
+        <w:rPr>
+          <w:rFonts w:ascii="Arial" w:hAnsi="Arial" w:cs="Arial"/>
+          <w:sz w:val="24"/>
+          <w:szCs w:val="24"/>
+        </w:rPr>
+        <w:t>Administrador General</w:t>
       </w:r>
     </w:p>
     <w:p>
@@ -481,100 +548,7 @@
           <w:sz w:val="24"/>
           <w:szCs w:val="24"/>
         </w:rPr>
-        <w:t xml:space="preserve"> </w:t>
-      </w:r>
-      <w:r>
-        <w:rPr>
-          <w:rFonts w:ascii="Arial" w:hAnsi="Arial" w:cs="Arial"/>
-          <w:sz w:val="24"/>
-          <w:szCs w:val="24"/>
-        </w:rPr>
-        <w:t>Gestionar (Agregar, modificar, eliminar, ver)</w:t>
-      </w:r>
-      <w:r>
-        <w:rPr>
-          <w:rFonts w:ascii="Arial" w:hAnsi="Arial" w:cs="Arial"/>
-          <w:sz w:val="24"/>
-          <w:szCs w:val="24"/>
-        </w:rPr>
-        <w:t xml:space="preserve"> los Trabajadores Autorizados a firmar un contrato.</w:t>
-      </w:r>
-    </w:p>
-    <w:p>
-      <w:pPr>
-        <w:pStyle w:val="Prrafodelista"/>
-        <w:numPr>
-          <w:ilvl w:val="0"/>
-          <w:numId w:val="2"/>
-        </w:numPr>
-        <w:rPr>
-          <w:rFonts w:ascii="Arial" w:hAnsi="Arial" w:cs="Arial"/>
-          <w:sz w:val="24"/>
-          <w:szCs w:val="24"/>
-        </w:rPr>
-      </w:pPr>
-      <w:r>
-        <w:rPr>
-          <w:rFonts w:ascii="Arial" w:hAnsi="Arial" w:cs="Arial"/>
-          <w:sz w:val="24"/>
-          <w:szCs w:val="24"/>
-        </w:rPr>
-        <w:t>Gestionar (Agregar, modificar, eliminar, ver)</w:t>
-      </w:r>
-      <w:r>
-        <w:rPr>
-          <w:rFonts w:ascii="Arial" w:hAnsi="Arial" w:cs="Arial"/>
-          <w:sz w:val="24"/>
-          <w:szCs w:val="24"/>
-        </w:rPr>
-        <w:t xml:space="preserve"> la asociación de Trabajadores Autorizados a contratos.</w:t>
-      </w:r>
-    </w:p>
-    <w:p>
-      <w:pPr>
-        <w:rPr>
-          <w:rFonts w:ascii="Arial" w:hAnsi="Arial" w:cs="Arial"/>
-          <w:sz w:val="24"/>
-          <w:szCs w:val="24"/>
-        </w:rPr>
-      </w:pPr>
-      <w:r>
-        <w:rPr>
-          <w:rFonts w:ascii="Arial" w:hAnsi="Arial" w:cs="Arial"/>
-          <w:sz w:val="24"/>
-          <w:szCs w:val="24"/>
-        </w:rPr>
-        <w:t>Administrador General</w:t>
-      </w:r>
-    </w:p>
-    <w:p>
-      <w:pPr>
-        <w:pStyle w:val="Prrafodelista"/>
-        <w:numPr>
-          <w:ilvl w:val="0"/>
-          <w:numId w:val="2"/>
-        </w:numPr>
-        <w:rPr>
-          <w:rFonts w:ascii="Arial" w:hAnsi="Arial" w:cs="Arial"/>
-          <w:sz w:val="24"/>
-          <w:szCs w:val="24"/>
-        </w:rPr>
-      </w:pPr>
-      <w:r>
-        <w:rPr>
-          <w:rFonts w:ascii="Arial" w:hAnsi="Arial" w:cs="Arial"/>
-          <w:sz w:val="24"/>
-          <w:szCs w:val="24"/>
-        </w:rPr>
-        <w:t>Gestionar (Agregar, modificar, eliminar, ver)</w:t>
-      </w:r>
-      <w:r>
-        <w:rPr>
-          <w:rFonts w:ascii="Arial" w:hAnsi="Arial" w:cs="Arial"/>
-          <w:sz w:val="24"/>
-          <w:szCs w:val="24"/>
-        </w:rPr>
-        <w:t xml:space="preserve"> usuarios en el sistema.</w:t>
+        <w:t>Gestionar (Agregar, modificar, eliminar, ver) usuarios en el sistema.</w:t>
       </w:r>
     </w:p>
     <w:p>
@@ -799,6 +773,153 @@
         </w:rPr>
         <w:t>El software debe ser escalable para futuros posibles cambios que pueda sufrir este.</w:t>
       </w:r>
+    </w:p>
+    <w:p>
+      <w:pPr>
+        <w:rPr>
+          <w:b/>
+          <w:bCs/>
+          <w:sz w:val="32"/>
+          <w:szCs w:val="32"/>
+        </w:rPr>
+      </w:pPr>
+      <w:r>
+        <w:rPr>
+          <w:b/>
+          <w:bCs/>
+          <w:sz w:val="32"/>
+          <w:szCs w:val="32"/>
+        </w:rPr>
+        <w:lastRenderedPageBreak/>
+        <w:t>Reglas del Negocio:</w:t>
+      </w:r>
+    </w:p>
+    <w:p>
+      <w:pPr>
+        <w:pStyle w:val="Prrafodelista"/>
+        <w:numPr>
+          <w:ilvl w:val="0"/>
+          <w:numId w:val="5"/>
+        </w:numPr>
+        <w:rPr>
+          <w:rFonts w:ascii="Arial" w:hAnsi="Arial" w:cs="Arial"/>
+          <w:sz w:val="24"/>
+          <w:szCs w:val="24"/>
+        </w:rPr>
+      </w:pPr>
+      <w:r>
+        <w:rPr>
+          <w:rFonts w:ascii="Arial" w:hAnsi="Arial" w:cs="Arial"/>
+          <w:sz w:val="24"/>
+          <w:szCs w:val="24"/>
+        </w:rPr>
+        <w:t>Para realizar cualquier operación o consulta en el software los usuarios</w:t>
+      </w:r>
+      <w:r>
+        <w:rPr>
+          <w:rFonts w:ascii="Arial" w:hAnsi="Arial" w:cs="Arial"/>
+          <w:sz w:val="24"/>
+          <w:szCs w:val="24"/>
+        </w:rPr>
+        <w:t xml:space="preserve"> debe estar autentificado en el mismo.</w:t>
+      </w:r>
+    </w:p>
+    <w:p>
+      <w:pPr>
+        <w:pStyle w:val="Prrafodelista"/>
+        <w:numPr>
+          <w:ilvl w:val="0"/>
+          <w:numId w:val="5"/>
+        </w:numPr>
+        <w:rPr>
+          <w:rFonts w:ascii="Arial" w:hAnsi="Arial" w:cs="Arial"/>
+          <w:sz w:val="24"/>
+          <w:szCs w:val="24"/>
+        </w:rPr>
+      </w:pPr>
+      <w:r>
+        <w:rPr>
+          <w:rFonts w:ascii="Arial" w:hAnsi="Arial" w:cs="Arial"/>
+          <w:sz w:val="24"/>
+          <w:szCs w:val="24"/>
+        </w:rPr>
+        <w:t>Cada autentificación del usuario en el software tendrá una duración de 3h. Al terminar este tiempo el usuario debe volver a autentificarse.</w:t>
+      </w:r>
+    </w:p>
+    <w:p>
+      <w:pPr>
+        <w:pStyle w:val="Prrafodelista"/>
+        <w:numPr>
+          <w:ilvl w:val="0"/>
+          <w:numId w:val="5"/>
+        </w:numPr>
+        <w:rPr>
+          <w:rFonts w:ascii="Arial" w:hAnsi="Arial" w:cs="Arial"/>
+          <w:sz w:val="24"/>
+          <w:szCs w:val="24"/>
+        </w:rPr>
+      </w:pPr>
+      <w:r>
+        <w:rPr>
+          <w:rFonts w:ascii="Arial" w:hAnsi="Arial" w:cs="Arial"/>
+          <w:sz w:val="24"/>
+          <w:szCs w:val="24"/>
+        </w:rPr>
+        <w:t>Un usuario solo puede acceder al sistema si es que un administrador no le ha denegado el acceso a este.</w:t>
+      </w:r>
+    </w:p>
+    <w:p>
+      <w:pPr>
+        <w:pStyle w:val="Prrafodelista"/>
+        <w:numPr>
+          <w:ilvl w:val="0"/>
+          <w:numId w:val="5"/>
+        </w:numPr>
+        <w:rPr>
+          <w:rFonts w:ascii="Arial" w:hAnsi="Arial" w:cs="Arial"/>
+          <w:sz w:val="24"/>
+          <w:szCs w:val="24"/>
+        </w:rPr>
+      </w:pPr>
+      <w:r>
+        <w:rPr>
+          <w:rFonts w:ascii="Arial" w:hAnsi="Arial" w:cs="Arial"/>
+          <w:sz w:val="24"/>
+          <w:szCs w:val="24"/>
+        </w:rPr>
+        <w:t>El único que puede crear usuarios en el sistema es el administrador general.</w:t>
+      </w:r>
+    </w:p>
+    <w:p>
+      <w:pPr>
+        <w:pStyle w:val="Prrafodelista"/>
+        <w:numPr>
+          <w:ilvl w:val="0"/>
+          <w:numId w:val="5"/>
+        </w:numPr>
+        <w:rPr>
+          <w:rFonts w:ascii="Arial" w:hAnsi="Arial" w:cs="Arial"/>
+          <w:sz w:val="24"/>
+          <w:szCs w:val="24"/>
+        </w:rPr>
+      </w:pPr>
+      <w:r>
+        <w:rPr>
+          <w:rFonts w:ascii="Arial" w:hAnsi="Arial" w:cs="Arial"/>
+          <w:sz w:val="24"/>
+          <w:szCs w:val="24"/>
+        </w:rPr>
+        <w:t>Solo puede existir un administrador general en el sistema.</w:t>
+      </w:r>
+    </w:p>
+    <w:p>
+      <w:pPr>
+        <w:rPr>
+          <w:rFonts w:ascii="Arial" w:hAnsi="Arial" w:cs="Arial"/>
+          <w:sz w:val="24"/>
+          <w:szCs w:val="24"/>
+        </w:rPr>
+      </w:pPr>
     </w:p>
     <w:sectPr>
       <w:pgSz w:w="12240" w:h="15840" w:code="1"/>
@@ -926,6 +1047,95 @@
     </w:lvl>
   </w:abstractNum>
   <w:abstractNum w:abstractNumId="1" w15:restartNumberingAfterBreak="0">
+    <w:nsid w:val="5ACC1357"/>
+    <w:multiLevelType w:val="hybridMultilevel"/>
+    <w:tmpl w:val="12908364"/>
+    <w:lvl w:ilvl="0" w:tplc="8D6AAB74">
+      <w:start w:val="1"/>
+      <w:numFmt w:val="decimal"/>
+      <w:lvlText w:val="%1-"/>
+      <w:lvlJc w:val="left"/>
+      <w:pPr>
+        <w:ind w:left="720" w:hanging="360"/>
+      </w:pPr>
+      <w:rPr>
+        <w:rFonts w:hint="default"/>
+      </w:rPr>
+    </w:lvl>
+    <w:lvl w:ilvl="1" w:tplc="0C0A0019" w:tentative="1">
+      <w:start w:val="1"/>
+      <w:numFmt w:val="lowerLetter"/>
+      <w:lvlText w:val="%2."/>
+      <w:lvlJc w:val="left"/>
+      <w:pPr>
+        <w:ind w:left="1440" w:hanging="360"/>
+      </w:pPr>
+    </w:lvl>
+    <w:lvl w:ilvl="2" w:tplc="0C0A001B" w:tentative="1">
+      <w:start w:val="1"/>
+      <w:numFmt w:val="lowerRoman"/>
+      <w:lvlText w:val="%3."/>
+      <w:lvlJc w:val="right"/>
+      <w:pPr>
+        <w:ind w:left="2160" w:hanging="180"/>
+      </w:pPr>
+    </w:lvl>
+    <w:lvl w:ilvl="3" w:tplc="0C0A000F" w:tentative="1">
+      <w:start w:val="1"/>
+      <w:numFmt w:val="decimal"/>
+      <w:lvlText w:val="%4."/>
+      <w:lvlJc w:val="left"/>
+      <w:pPr>
+        <w:ind w:left="2880" w:hanging="360"/>
+      </w:pPr>
+    </w:lvl>
+    <w:lvl w:ilvl="4" w:tplc="0C0A0019" w:tentative="1">
+      <w:start w:val="1"/>
+      <w:numFmt w:val="lowerLetter"/>
+      <w:lvlText w:val="%5."/>
+      <w:lvlJc w:val="left"/>
+      <w:pPr>
+        <w:ind w:left="3600" w:hanging="360"/>
+      </w:pPr>
+    </w:lvl>
+    <w:lvl w:ilvl="5" w:tplc="0C0A001B" w:tentative="1">
+      <w:start w:val="1"/>
+      <w:numFmt w:val="lowerRoman"/>
+      <w:lvlText w:val="%6."/>
+      <w:lvlJc w:val="right"/>
+      <w:pPr>
+        <w:ind w:left="4320" w:hanging="180"/>
+      </w:pPr>
+    </w:lvl>
+    <w:lvl w:ilvl="6" w:tplc="0C0A000F" w:tentative="1">
+      <w:start w:val="1"/>
+      <w:numFmt w:val="decimal"/>
+      <w:lvlText w:val="%7."/>
+      <w:lvlJc w:val="left"/>
+      <w:pPr>
+        <w:ind w:left="5040" w:hanging="360"/>
+      </w:pPr>
+    </w:lvl>
+    <w:lvl w:ilvl="7" w:tplc="0C0A0019" w:tentative="1">
+      <w:start w:val="1"/>
+      <w:numFmt w:val="lowerLetter"/>
+      <w:lvlText w:val="%8."/>
+      <w:lvlJc w:val="left"/>
+      <w:pPr>
+        <w:ind w:left="5760" w:hanging="360"/>
+      </w:pPr>
+    </w:lvl>
+    <w:lvl w:ilvl="8" w:tplc="0C0A001B" w:tentative="1">
+      <w:start w:val="1"/>
+      <w:numFmt w:val="lowerRoman"/>
+      <w:lvlText w:val="%9."/>
+      <w:lvlJc w:val="right"/>
+      <w:pPr>
+        <w:ind w:left="6480" w:hanging="180"/>
+      </w:pPr>
+    </w:lvl>
+  </w:abstractNum>
+  <w:abstractNum w:abstractNumId="2" w15:restartNumberingAfterBreak="0">
     <w:nsid w:val="602E13E6"/>
     <w:multiLevelType w:val="hybridMultilevel"/>
     <w:tmpl w:val="298C53CE"/>
@@ -1037,7 +1247,96 @@
       </w:rPr>
     </w:lvl>
   </w:abstractNum>
-  <w:abstractNum w:abstractNumId="2" w15:restartNumberingAfterBreak="0">
+  <w:abstractNum w:abstractNumId="3" w15:restartNumberingAfterBreak="0">
+    <w:nsid w:val="7A665F7E"/>
+    <w:multiLevelType w:val="hybridMultilevel"/>
+    <w:tmpl w:val="48789B22"/>
+    <w:lvl w:ilvl="0" w:tplc="738AE002">
+      <w:start w:val="1"/>
+      <w:numFmt w:val="decimal"/>
+      <w:lvlText w:val="%1-"/>
+      <w:lvlJc w:val="left"/>
+      <w:pPr>
+        <w:ind w:left="720" w:hanging="360"/>
+      </w:pPr>
+      <w:rPr>
+        <w:rFonts w:hint="default"/>
+      </w:rPr>
+    </w:lvl>
+    <w:lvl w:ilvl="1" w:tplc="0C0A0019" w:tentative="1">
+      <w:start w:val="1"/>
+      <w:numFmt w:val="lowerLetter"/>
+      <w:lvlText w:val="%2."/>
+      <w:lvlJc w:val="left"/>
+      <w:pPr>
+        <w:ind w:left="1440" w:hanging="360"/>
+      </w:pPr>
+    </w:lvl>
+    <w:lvl w:ilvl="2" w:tplc="0C0A001B" w:tentative="1">
+      <w:start w:val="1"/>
+      <w:numFmt w:val="lowerRoman"/>
+      <w:lvlText w:val="%3."/>
+      <w:lvlJc w:val="right"/>
+      <w:pPr>
+        <w:ind w:left="2160" w:hanging="180"/>
+      </w:pPr>
+    </w:lvl>
+    <w:lvl w:ilvl="3" w:tplc="0C0A000F" w:tentative="1">
+      <w:start w:val="1"/>
+      <w:numFmt w:val="decimal"/>
+      <w:lvlText w:val="%4."/>
+      <w:lvlJc w:val="left"/>
+      <w:pPr>
+        <w:ind w:left="2880" w:hanging="360"/>
+      </w:pPr>
+    </w:lvl>
+    <w:lvl w:ilvl="4" w:tplc="0C0A0019" w:tentative="1">
+      <w:start w:val="1"/>
+      <w:numFmt w:val="lowerLetter"/>
+      <w:lvlText w:val="%5."/>
+      <w:lvlJc w:val="left"/>
+      <w:pPr>
+        <w:ind w:left="3600" w:hanging="360"/>
+      </w:pPr>
+    </w:lvl>
+    <w:lvl w:ilvl="5" w:tplc="0C0A001B" w:tentative="1">
+      <w:start w:val="1"/>
+      <w:numFmt w:val="lowerRoman"/>
+      <w:lvlText w:val="%6."/>
+      <w:lvlJc w:val="right"/>
+      <w:pPr>
+        <w:ind w:left="4320" w:hanging="180"/>
+      </w:pPr>
+    </w:lvl>
+    <w:lvl w:ilvl="6" w:tplc="0C0A000F" w:tentative="1">
+      <w:start w:val="1"/>
+      <w:numFmt w:val="decimal"/>
+      <w:lvlText w:val="%7."/>
+      <w:lvlJc w:val="left"/>
+      <w:pPr>
+        <w:ind w:left="5040" w:hanging="360"/>
+      </w:pPr>
+    </w:lvl>
+    <w:lvl w:ilvl="7" w:tplc="0C0A0019" w:tentative="1">
+      <w:start w:val="1"/>
+      <w:numFmt w:val="lowerLetter"/>
+      <w:lvlText w:val="%8."/>
+      <w:lvlJc w:val="left"/>
+      <w:pPr>
+        <w:ind w:left="5760" w:hanging="360"/>
+      </w:pPr>
+    </w:lvl>
+    <w:lvl w:ilvl="8" w:tplc="0C0A001B" w:tentative="1">
+      <w:start w:val="1"/>
+      <w:numFmt w:val="lowerRoman"/>
+      <w:lvlText w:val="%9."/>
+      <w:lvlJc w:val="right"/>
+      <w:pPr>
+        <w:ind w:left="6480" w:hanging="180"/>
+      </w:pPr>
+    </w:lvl>
+  </w:abstractNum>
+  <w:abstractNum w:abstractNumId="4" w15:restartNumberingAfterBreak="0">
     <w:nsid w:val="7EF25617"/>
     <w:multiLevelType w:val="hybridMultilevel"/>
     <w:tmpl w:val="F12CAD3C"/>
@@ -1127,13 +1426,19 @@
     </w:lvl>
   </w:abstractNum>
   <w:num w:numId="1" w16cid:durableId="773597788">
-    <w:abstractNumId w:val="1"/>
+    <w:abstractNumId w:val="2"/>
   </w:num>
   <w:num w:numId="2" w16cid:durableId="543709925">
     <w:abstractNumId w:val="0"/>
   </w:num>
   <w:num w:numId="3" w16cid:durableId="2087532906">
-    <w:abstractNumId w:val="2"/>
+    <w:abstractNumId w:val="4"/>
+  </w:num>
+  <w:num w:numId="4" w16cid:durableId="2111077475">
+    <w:abstractNumId w:val="1"/>
+  </w:num>
+  <w:num w:numId="5" w16cid:durableId="1377198568">
+    <w:abstractNumId w:val="3"/>
   </w:num>
 </w:numbering>
 </file>

</xml_diff>